<commit_message>
:sparkles: :bug: added tutor and fixing bugs on code
</commit_message>
<xml_diff>
--- a/src/assets/planejamentoDiario1.docx
+++ b/src/assets/planejamentoDiario1.docx
@@ -65,8 +65,8 @@
         <w:tblLook w:val="0000"/>
       </w:tblPr>
       <w:tblGrid>
-        <w:gridCol w:w="3107"/>
-        <w:gridCol w:w="7518"/>
+        <w:gridCol w:w="1186"/>
+        <w:gridCol w:w="9439"/>
       </w:tblGrid>
       <w:tr>
         <w:trPr>
@@ -192,7 +192,7 @@
         </w:trPr>
         <w:tc>
           <w:tcPr>
-            <w:tcW w:w="3107" w:type="dxa"/>
+            <w:tcW w:w="1186" w:type="dxa"/>
             <w:tcBorders>
               <w:top w:val="single" w:sz="8" w:space="0" w:color="000000"/>
               <w:left w:val="single" w:sz="8" w:space="0" w:color="000000"/>
@@ -234,13 +234,108 @@
                 <w:shd w:fill="auto" w:val="clear"/>
                 <w:vertAlign w:val="baseline"/>
               </w:rPr>
-              <w:t>HORÁROS</w:t>
+              <w:t>E</w:t>
+            </w:r>
+            <w:r>
+              <w:rPr>
+                <w:rFonts w:eastAsia="Arial" w:cs="Arial" w:ascii="Arial" w:hAnsi="Arial"/>
+                <w:b/>
+                <w:i w:val="false"/>
+                <w:caps w:val="false"/>
+                <w:smallCaps w:val="false"/>
+                <w:strike w:val="false"/>
+                <w:dstrike w:val="false"/>
+                <w:color w:val="000000"/>
+                <w:position w:val="0"/>
+                <w:sz w:val="24"/>
+                <w:szCs w:val="24"/>
+                <w:u w:val="none"/>
+                <w:shd w:fill="auto" w:val="clear"/>
+                <w:vertAlign w:val="baseline"/>
+              </w:rPr>
+              <w:t>x</w:t>
+            </w:r>
+            <w:r>
+              <w:rPr>
+                <w:rFonts w:eastAsia="Arial" w:cs="Arial" w:ascii="Arial" w:hAnsi="Arial"/>
+                <w:b/>
+                <w:i w:val="false"/>
+                <w:caps w:val="false"/>
+                <w:smallCaps w:val="false"/>
+                <w:strike w:val="false"/>
+                <w:dstrike w:val="false"/>
+                <w:color w:val="000000"/>
+                <w:position w:val="0"/>
+                <w:sz w:val="24"/>
+                <w:szCs w:val="24"/>
+                <w:u w:val="none"/>
+                <w:shd w:fill="auto" w:val="clear"/>
+                <w:vertAlign w:val="baseline"/>
+              </w:rPr>
+              <w:t>t</w:t>
+            </w:r>
+            <w:r>
+              <w:rPr>
+                <w:rFonts w:eastAsia="Arial" w:cs="Arial" w:ascii="Arial" w:hAnsi="Arial"/>
+                <w:b/>
+                <w:i w:val="false"/>
+                <w:caps w:val="false"/>
+                <w:smallCaps w:val="false"/>
+                <w:strike w:val="false"/>
+                <w:dstrike w:val="false"/>
+                <w:color w:val="000000"/>
+                <w:position w:val="0"/>
+                <w:sz w:val="24"/>
+                <w:szCs w:val="24"/>
+                <w:u w:val="none"/>
+                <w:shd w:fill="auto" w:val="clear"/>
+                <w:vertAlign w:val="baseline"/>
+              </w:rPr>
+              <w:t>r</w:t>
+            </w:r>
+            <w:r>
+              <w:rPr>
+                <w:rFonts w:eastAsia="Arial" w:cs="Arial" w:ascii="Arial" w:hAnsi="Arial"/>
+                <w:b/>
+                <w:i w:val="false"/>
+                <w:caps w:val="false"/>
+                <w:smallCaps w:val="false"/>
+                <w:strike w:val="false"/>
+                <w:dstrike w:val="false"/>
+                <w:color w:val="000000"/>
+                <w:position w:val="0"/>
+                <w:sz w:val="24"/>
+                <w:szCs w:val="24"/>
+                <w:u w:val="none"/>
+                <w:shd w:fill="auto" w:val="clear"/>
+                <w:vertAlign w:val="baseline"/>
+              </w:rPr>
+              <w:t>a</w:t>
+            </w:r>
+            <w:r>
+              <w:rPr>
+                <w:rFonts w:eastAsia="Arial" w:cs="Arial" w:ascii="Arial" w:hAnsi="Arial"/>
+                <w:b/>
+                <w:i w:val="false"/>
+                <w:caps w:val="false"/>
+                <w:smallCaps w:val="false"/>
+                <w:strike w:val="false"/>
+                <w:dstrike w:val="false"/>
+                <w:color w:val="000000"/>
+                <w:position w:val="0"/>
+                <w:sz w:val="24"/>
+                <w:szCs w:val="24"/>
+                <w:u w:val="none"/>
+                <w:shd w:fill="auto" w:val="clear"/>
+                <w:vertAlign w:val="baseline"/>
+              </w:rPr>
+              <w:t>s</w:t>
             </w:r>
           </w:p>
         </w:tc>
         <w:tc>
           <w:tcPr>
-            <w:tcW w:w="7518" w:type="dxa"/>
+            <w:tcW w:w="9439" w:type="dxa"/>
             <w:tcBorders>
               <w:top w:val="single" w:sz="8" w:space="0" w:color="000000"/>
               <w:left w:val="single" w:sz="8" w:space="0" w:color="000000"/>
@@ -293,7 +388,7 @@
         </w:trPr>
         <w:tc>
           <w:tcPr>
-            <w:tcW w:w="3107" w:type="dxa"/>
+            <w:tcW w:w="1186" w:type="dxa"/>
             <w:tcBorders>
               <w:top w:val="single" w:sz="8" w:space="0" w:color="000000"/>
               <w:left w:val="single" w:sz="8" w:space="0" w:color="000000"/>
@@ -388,7 +483,7 @@
         </w:tc>
         <w:tc>
           <w:tcPr>
-            <w:tcW w:w="7518" w:type="dxa"/>
+            <w:tcW w:w="9439" w:type="dxa"/>
             <w:tcBorders>
               <w:top w:val="single" w:sz="8" w:space="0" w:color="000000"/>
               <w:left w:val="single" w:sz="8" w:space="0" w:color="000000"/>
@@ -433,7 +528,7 @@
         </w:trPr>
         <w:tc>
           <w:tcPr>
-            <w:tcW w:w="3107" w:type="dxa"/>
+            <w:tcW w:w="1186" w:type="dxa"/>
             <w:tcBorders>
               <w:top w:val="single" w:sz="8" w:space="0" w:color="000000"/>
               <w:left w:val="single" w:sz="8" w:space="0" w:color="000000"/>
@@ -490,7 +585,7 @@
         </w:tc>
         <w:tc>
           <w:tcPr>
-            <w:tcW w:w="7518" w:type="dxa"/>
+            <w:tcW w:w="9439" w:type="dxa"/>
             <w:tcBorders>
               <w:top w:val="single" w:sz="8" w:space="0" w:color="000000"/>
               <w:left w:val="single" w:sz="8" w:space="0" w:color="000000"/>
@@ -548,7 +643,7 @@
         </w:trPr>
         <w:tc>
           <w:tcPr>
-            <w:tcW w:w="3107" w:type="dxa"/>
+            <w:tcW w:w="1186" w:type="dxa"/>
             <w:tcBorders>
               <w:top w:val="single" w:sz="8" w:space="0" w:color="000000"/>
               <w:left w:val="single" w:sz="8" w:space="0" w:color="000000"/>
@@ -606,7 +701,7 @@
         </w:tc>
         <w:tc>
           <w:tcPr>
-            <w:tcW w:w="7518" w:type="dxa"/>
+            <w:tcW w:w="9439" w:type="dxa"/>
             <w:tcBorders>
               <w:top w:val="single" w:sz="8" w:space="0" w:color="000000"/>
               <w:left w:val="single" w:sz="8" w:space="0" w:color="000000"/>
@@ -703,7 +798,7 @@
     <w:tbl>
       <w:tblPr>
         <w:tblStyle w:val="Table2"/>
-        <w:tblW w:w="10725" w:type="dxa"/>
+        <w:tblW w:w="10732" w:type="dxa"/>
         <w:jc w:val="left"/>
         <w:tblInd w:w="2788" w:type="dxa"/>
         <w:tblLayout w:type="fixed"/>
@@ -716,8 +811,8 @@
         <w:tblLook w:val="0000"/>
       </w:tblPr>
       <w:tblGrid>
-        <w:gridCol w:w="3229"/>
-        <w:gridCol w:w="7496"/>
+        <w:gridCol w:w="1186"/>
+        <w:gridCol w:w="9546"/>
       </w:tblGrid>
       <w:tr>
         <w:trPr>
@@ -725,7 +820,7 @@
         </w:trPr>
         <w:tc>
           <w:tcPr>
-            <w:tcW w:w="3229" w:type="dxa"/>
+            <w:tcW w:w="1186" w:type="dxa"/>
             <w:tcBorders>
               <w:left w:val="single" w:sz="4" w:space="0" w:color="000000"/>
               <w:bottom w:val="single" w:sz="4" w:space="0" w:color="000000"/>
@@ -781,7 +876,7 @@
         </w:tc>
         <w:tc>
           <w:tcPr>
-            <w:tcW w:w="7496" w:type="dxa"/>
+            <w:tcW w:w="9546" w:type="dxa"/>
             <w:tcBorders>
               <w:left w:val="single" w:sz="4" w:space="0" w:color="000000"/>
               <w:bottom w:val="single" w:sz="4" w:space="0" w:color="000000"/>
@@ -852,7 +947,7 @@
         </w:trPr>
         <w:tc>
           <w:tcPr>
-            <w:tcW w:w="3229" w:type="dxa"/>
+            <w:tcW w:w="1186" w:type="dxa"/>
             <w:tcBorders>
               <w:top w:val="single" w:sz="4" w:space="0" w:color="000000"/>
               <w:left w:val="single" w:sz="4" w:space="0" w:color="000000"/>
@@ -886,7 +981,7 @@
         </w:tc>
         <w:tc>
           <w:tcPr>
-            <w:tcW w:w="7496" w:type="dxa"/>
+            <w:tcW w:w="9546" w:type="dxa"/>
             <w:tcBorders>
               <w:top w:val="single" w:sz="4" w:space="0" w:color="000000"/>
               <w:left w:val="single" w:sz="4" w:space="0" w:color="000000"/>
@@ -915,27 +1010,7 @@
                 <w:sz w:val="24"/>
                 <w:szCs w:val="24"/>
               </w:rPr>
-              <w:t>Atividade</w:t>
-            </w:r>
-            <w:r>
-              <w:rPr>
-                <w:rFonts w:eastAsia="Arial" w:cs="Arial" w:ascii="Arial" w:hAnsi="Arial"/>
-                <w:b/>
-                <w:color w:val="000000"/>
-                <w:sz w:val="24"/>
-                <w:szCs w:val="24"/>
-              </w:rPr>
-              <w:t>(s)</w:t>
-            </w:r>
-            <w:r>
-              <w:rPr>
-                <w:rFonts w:eastAsia="Arial" w:cs="Arial" w:ascii="Arial" w:hAnsi="Arial"/>
-                <w:b/>
-                <w:color w:val="000000"/>
-                <w:sz w:val="24"/>
-                <w:szCs w:val="24"/>
-              </w:rPr>
-              <w:t xml:space="preserve">: </w:t>
+              <w:t xml:space="preserve">Atividade(s): </w:t>
             </w:r>
             <w:r>
               <w:rPr>
@@ -1000,8 +1075,8 @@
         <w:tblLook w:val="0000"/>
       </w:tblPr>
       <w:tblGrid>
-        <w:gridCol w:w="3044"/>
-        <w:gridCol w:w="7576"/>
+        <w:gridCol w:w="1105"/>
+        <w:gridCol w:w="9515"/>
       </w:tblGrid>
       <w:tr>
         <w:trPr>
@@ -1009,7 +1084,7 @@
         </w:trPr>
         <w:tc>
           <w:tcPr>
-            <w:tcW w:w="3044" w:type="dxa"/>
+            <w:tcW w:w="1105" w:type="dxa"/>
             <w:tcBorders>
               <w:top w:val="single" w:sz="4" w:space="0" w:color="000000"/>
               <w:left w:val="single" w:sz="4" w:space="0" w:color="000000"/>
@@ -1033,7 +1108,7 @@
         </w:tc>
         <w:tc>
           <w:tcPr>
-            <w:tcW w:w="7576" w:type="dxa"/>
+            <w:tcW w:w="9515" w:type="dxa"/>
             <w:tcBorders>
               <w:top w:val="single" w:sz="4" w:space="0" w:color="000000"/>
               <w:left w:val="single" w:sz="4" w:space="0" w:color="000000"/>
@@ -1071,7 +1146,7 @@
         </w:trPr>
         <w:tc>
           <w:tcPr>
-            <w:tcW w:w="3044" w:type="dxa"/>
+            <w:tcW w:w="1105" w:type="dxa"/>
             <w:tcBorders>
               <w:top w:val="single" w:sz="4" w:space="0" w:color="000000"/>
               <w:left w:val="single" w:sz="4" w:space="0" w:color="000000"/>
@@ -1128,7 +1203,7 @@
         </w:tc>
         <w:tc>
           <w:tcPr>
-            <w:tcW w:w="7576" w:type="dxa"/>
+            <w:tcW w:w="9515" w:type="dxa"/>
             <w:tcBorders>
               <w:top w:val="single" w:sz="4" w:space="0" w:color="000000"/>
               <w:left w:val="single" w:sz="4" w:space="0" w:color="000000"/>
@@ -1222,8 +1297,8 @@
         <w:tblLook w:val="0000"/>
       </w:tblPr>
       <w:tblGrid>
-        <w:gridCol w:w="3070"/>
-        <w:gridCol w:w="7565"/>
+        <w:gridCol w:w="1105"/>
+        <w:gridCol w:w="9530"/>
       </w:tblGrid>
       <w:tr>
         <w:trPr>
@@ -1231,7 +1306,7 @@
         </w:trPr>
         <w:tc>
           <w:tcPr>
-            <w:tcW w:w="3070" w:type="dxa"/>
+            <w:tcW w:w="1105" w:type="dxa"/>
             <w:tcBorders>
               <w:left w:val="single" w:sz="4" w:space="0" w:color="000000"/>
               <w:bottom w:val="single" w:sz="4" w:space="0" w:color="000000"/>
@@ -1288,7 +1363,7 @@
         </w:tc>
         <w:tc>
           <w:tcPr>
-            <w:tcW w:w="7565" w:type="dxa"/>
+            <w:tcW w:w="9530" w:type="dxa"/>
             <w:tcBorders>
               <w:left w:val="single" w:sz="4" w:space="0" w:color="000000"/>
               <w:bottom w:val="single" w:sz="4" w:space="0" w:color="000000"/>
@@ -1375,7 +1450,7 @@
         </w:trPr>
         <w:tc>
           <w:tcPr>
-            <w:tcW w:w="3070" w:type="dxa"/>
+            <w:tcW w:w="1105" w:type="dxa"/>
             <w:tcBorders>
               <w:top w:val="single" w:sz="4" w:space="0" w:color="000000"/>
               <w:left w:val="single" w:sz="4" w:space="0" w:color="000000"/>
@@ -1432,7 +1507,7 @@
         </w:tc>
         <w:tc>
           <w:tcPr>
-            <w:tcW w:w="7565" w:type="dxa"/>
+            <w:tcW w:w="9530" w:type="dxa"/>
             <w:tcBorders>
               <w:top w:val="single" w:sz="4" w:space="0" w:color="000000"/>
               <w:left w:val="single" w:sz="4" w:space="0" w:color="000000"/>
@@ -1556,6 +1631,40 @@
         <w:keepNext w:val="false"/>
         <w:keepLines w:val="false"/>
         <w:pageBreakBefore w:val="false"/>
+        <w:widowControl w:val="false"/>
+        <w:shd w:val="clear" w:fill="auto"/>
+        <w:spacing w:lineRule="auto" w:line="262" w:before="0" w:after="0"/>
+        <w:ind w:hanging="0" w:left="0" w:right="0"/>
+        <w:jc w:val="left"/>
+        <w:rPr>
+          <w:rFonts w:ascii="Arial" w:hAnsi="Arial" w:eastAsia="Arial" w:cs="Arial"/>
+          <w:color w:val="000000"/>
+          <w:sz w:val="24"/>
+          <w:szCs w:val="24"/>
+        </w:rPr>
+      </w:pPr>
+      <w:r>
+        <w:rPr>
+          <w:rFonts w:eastAsia="Arial" w:cs="Arial" w:ascii="Arial" w:hAnsi="Arial"/>
+          <w:b/>
+          <w:i w:val="false"/>
+          <w:caps w:val="false"/>
+          <w:smallCaps w:val="false"/>
+          <w:strike w:val="false"/>
+          <w:dstrike w:val="false"/>
+          <w:color w:val="000000"/>
+          <w:position w:val="0"/>
+          <w:sz w:val="24"/>
+          <w:szCs w:val="24"/>
+          <w:u w:val="none"/>
+          <w:shd w:fill="auto" w:val="clear"/>
+          <w:vertAlign w:val="baseline"/>
+        </w:rPr>
+      </w:r>
+    </w:p>
+    <w:p>
+      <w:pPr>
+        <w:pStyle w:val="normal1"/>
         <w:widowControl w:val="false"/>
         <w:shd w:val="clear" w:fill="auto"/>
         <w:spacing w:lineRule="auto" w:line="262" w:before="0" w:after="0"/>

</xml_diff>